<commit_message>
Delete some codes that I didnt use
changing some of the code comment
</commit_message>
<xml_diff>
--- a/FC723 Portfolio Project 1 pseudocode.docx
+++ b/FC723 Portfolio Project 1 pseudocode.docx
@@ -12,16 +12,20 @@
         <w:rPr>
           <w:lang w:val="en-US"/>
         </w:rPr>
-        <w:t xml:space="preserve">First having two </w:t>
-      </w:r>
-      <w:proofErr w:type="gramStart"/>
-      <w:r>
-        <w:rPr>
-          <w:lang w:val="en-US"/>
-        </w:rPr>
-        <w:t>input</w:t>
-      </w:r>
-      <w:proofErr w:type="gramEnd"/>
+        <w:t>Input</w:t>
+      </w:r>
+      <w:r>
+        <w:rPr>
+          <w:lang w:val="en-US"/>
+        </w:rPr>
+        <w:t xml:space="preserve"> two input</w:t>
+      </w:r>
+      <w:r>
+        <w:rPr>
+          <w:lang w:val="en-US"/>
+        </w:rPr>
+        <w:t>s</w:t>
+      </w:r>
     </w:p>
     <w:p>
       <w:pPr>
@@ -33,7 +37,13 @@
         <w:rPr>
           <w:lang w:val="en-US"/>
         </w:rPr>
-        <w:t>Then check</w:t>
+        <w:t>C</w:t>
+      </w:r>
+      <w:r>
+        <w:rPr>
+          <w:lang w:val="en-US"/>
+        </w:rPr>
+        <w:t>heck</w:t>
       </w:r>
       <w:r>
         <w:rPr>
@@ -45,20 +55,19 @@
         <w:rPr>
           <w:lang w:val="en-US"/>
         </w:rPr>
-        <w:t>which is smaller</w:t>
-      </w:r>
-    </w:p>
-    <w:p>
-      <w:pPr>
-        <w:rPr>
-          <w:lang w:val="en-US"/>
-        </w:rPr>
-      </w:pPr>
-      <w:r>
-        <w:rPr>
-          <w:lang w:val="en-US"/>
-        </w:rPr>
-        <w:t>Define quotient and remainder</w:t>
+        <w:t>which</w:t>
+      </w:r>
+      <w:r>
+        <w:rPr>
+          <w:lang w:val="en-US"/>
+        </w:rPr>
+        <w:t xml:space="preserve"> input</w:t>
+      </w:r>
+      <w:r>
+        <w:rPr>
+          <w:lang w:val="en-US"/>
+        </w:rPr>
+        <w:t xml:space="preserve"> is smaller</w:t>
       </w:r>
     </w:p>
     <w:p>
@@ -170,23 +179,24 @@
         <w:rPr>
           <w:lang w:val="en-US"/>
         </w:rPr>
-        <w:t xml:space="preserve">Then, </w:t>
-      </w:r>
-      <w:r>
-        <w:rPr>
-          <w:lang w:val="en-US"/>
-        </w:rPr>
-        <w:t xml:space="preserve">the value of </w:t>
-      </w:r>
-      <w:r>
-        <w:rPr>
-          <w:lang w:val="en-US"/>
-        </w:rPr>
-        <w:t>bigger input will be the smaller input</w:t>
+        <w:t xml:space="preserve">While the smaller input </w:t>
+      </w:r>
+      <w:r>
+        <w:rPr>
+          <w:lang w:val="en-US"/>
+        </w:rPr>
+        <w:t>not equal to</w:t>
+      </w:r>
+      <w:r>
+        <w:rPr>
+          <w:lang w:val="en-US"/>
+        </w:rPr>
+        <w:t xml:space="preserve"> 0</w:t>
       </w:r>
     </w:p>
     <w:p>
       <w:pPr>
+        <w:ind w:firstLine="720"/>
         <w:rPr>
           <w:lang w:val="en-US"/>
         </w:rPr>
@@ -195,11 +205,30 @@
         <w:rPr>
           <w:lang w:val="en-US"/>
         </w:rPr>
-        <w:t>Value of smaller input will be the remainder</w:t>
+        <w:t>V</w:t>
+      </w:r>
+      <w:r>
+        <w:rPr>
+          <w:lang w:val="en-US"/>
+        </w:rPr>
+        <w:t>a</w:t>
+      </w:r>
+      <w:r>
+        <w:rPr>
+          <w:lang w:val="en-US"/>
+        </w:rPr>
+        <w:t>lue of b</w:t>
+      </w:r>
+      <w:r>
+        <w:rPr>
+          <w:lang w:val="en-US"/>
+        </w:rPr>
+        <w:t>igger input will be the smaller input</w:t>
       </w:r>
     </w:p>
     <w:p>
       <w:pPr>
+        <w:ind w:firstLine="720"/>
         <w:rPr>
           <w:lang w:val="en-US"/>
         </w:rPr>
@@ -208,13 +237,33 @@
         <w:rPr>
           <w:lang w:val="en-US"/>
         </w:rPr>
+        <w:t>Value of smaller input will be the remainder</w:t>
+      </w:r>
+    </w:p>
+    <w:p>
+      <w:pPr>
+        <w:ind w:firstLine="720"/>
+        <w:rPr>
+          <w:lang w:val="en-US"/>
+        </w:rPr>
+      </w:pPr>
+      <w:r>
+        <w:rPr>
+          <w:lang w:val="en-US"/>
+        </w:rPr>
         <w:t xml:space="preserve">Then calculate new </w:t>
       </w:r>
       <w:r>
         <w:rPr>
           <w:lang w:val="en-US"/>
         </w:rPr>
-        <w:t>quotient n remainder</w:t>
+        <w:t>r</w:t>
+      </w:r>
+      <w:r>
+        <w:rPr>
+          <w:lang w:val="en-US"/>
+        </w:rPr>
+        <w:t>emainder</w:t>
       </w:r>
     </w:p>
     <w:p>
@@ -234,19 +283,75 @@
         <w:rPr>
           <w:lang w:val="en-US"/>
         </w:rPr>
-        <w:t xml:space="preserve">Keep loop till </w:t>
-      </w:r>
-      <w:r>
-        <w:rPr>
-          <w:lang w:val="en-US"/>
-        </w:rPr>
-        <w:t>re</w:t>
-      </w:r>
-      <w:r>
-        <w:rPr>
-          <w:lang w:val="en-US"/>
-        </w:rPr>
-        <w:t>mainder hits 0</w:t>
+        <w:t>Then the smaller input of that loop</w:t>
+      </w:r>
+      <w:r>
+        <w:rPr>
+          <w:lang w:val="en-US"/>
+        </w:rPr>
+        <w:t xml:space="preserve"> and remainder</w:t>
+      </w:r>
+      <w:r>
+        <w:rPr>
+          <w:lang w:val="en-US"/>
+        </w:rPr>
+        <w:t xml:space="preserve"> </w:t>
+      </w:r>
+      <w:r>
+        <w:rPr>
+          <w:lang w:val="en-US"/>
+        </w:rPr>
+        <w:t xml:space="preserve">from the last </w:t>
+      </w:r>
+      <w:proofErr w:type="gramStart"/>
+      <w:r>
+        <w:rPr>
+          <w:lang w:val="en-US"/>
+        </w:rPr>
+        <w:t>loop</w:t>
+      </w:r>
+      <w:r>
+        <w:rPr>
+          <w:lang w:val="en-US"/>
+        </w:rPr>
+        <w:t xml:space="preserve"> </w:t>
+      </w:r>
+      <w:r>
+        <w:rPr>
+          <w:lang w:val="en-US"/>
+        </w:rPr>
+        <w:t>,</w:t>
+      </w:r>
+      <w:proofErr w:type="gramEnd"/>
+      <w:r>
+        <w:rPr>
+          <w:lang w:val="en-US"/>
+        </w:rPr>
+        <w:t xml:space="preserve"> </w:t>
+      </w:r>
+      <w:r>
+        <w:rPr>
+          <w:lang w:val="en-US"/>
+        </w:rPr>
+        <w:t>which bigger input in current situation</w:t>
+      </w:r>
+      <w:r>
+        <w:rPr>
+          <w:lang w:val="en-US"/>
+        </w:rPr>
+        <w:t xml:space="preserve"> </w:t>
+      </w:r>
+      <w:r>
+        <w:rPr>
+          <w:lang w:val="en-US"/>
+        </w:rPr>
+        <w:t>will be the GCD</w:t>
+      </w:r>
+      <w:r>
+        <w:rPr>
+          <w:lang w:val="en-US"/>
+        </w:rPr>
+        <w:t>.</w:t>
       </w:r>
     </w:p>
     <w:p>
@@ -255,18 +360,6 @@
           <w:lang w:val="en-US"/>
         </w:rPr>
       </w:pPr>
-      <w:r>
-        <w:rPr>
-          <w:lang w:val="en-US"/>
-        </w:rPr>
-        <w:t>Then the smaller input of that loop will be the GCD</w:t>
-      </w:r>
-      <w:r>
-        <w:rPr>
-          <w:lang w:val="en-US"/>
-        </w:rPr>
-        <w:t>.</w:t>
-      </w:r>
     </w:p>
     <w:p>
       <w:pPr>
@@ -274,6 +367,32 @@
           <w:lang w:val="en-US"/>
         </w:rPr>
       </w:pPr>
+    </w:p>
+    <w:p>
+      <w:pPr>
+        <w:rPr>
+          <w:lang w:val="en-US"/>
+        </w:rPr>
+      </w:pPr>
+      <w:r>
+        <w:rPr>
+          <w:lang w:val="en-US"/>
+        </w:rPr>
+        <w:t>5.</w:t>
+      </w:r>
+    </w:p>
+    <w:p>
+      <w:pPr>
+        <w:rPr>
+          <w:lang w:val="en-US"/>
+        </w:rPr>
+      </w:pPr>
+      <w:r>
+        <w:rPr>
+          <w:lang w:val="en-US"/>
+        </w:rPr>
+        <w:t>6.</w:t>
+      </w:r>
     </w:p>
     <w:sectPr>
       <w:pgSz w:w="11906" w:h="16838"/>

</xml_diff>

<commit_message>
refactor the code again
also changing some code comment
</commit_message>
<xml_diff>
--- a/FC723 Portfolio Project 1 pseudocode.docx
+++ b/FC723 Portfolio Project 1 pseudocode.docx
@@ -4,6 +4,395 @@
   <w:body>
     <w:p>
       <w:pPr>
+        <w:pStyle w:val="NormalWeb"/>
+        <w:spacing w:before="0" w:beforeAutospacing="0" w:after="0" w:afterAutospacing="0"/>
+        <w:rPr>
+          <w:rFonts w:ascii="Arial" w:hAnsi="Arial" w:cs="Arial"/>
+          <w:sz w:val="22"/>
+          <w:szCs w:val="22"/>
+        </w:rPr>
+      </w:pPr>
+      <w:r>
+        <w:rPr>
+          <w:rFonts w:ascii="Arial" w:hAnsi="Arial" w:cs="Arial"/>
+          <w:sz w:val="22"/>
+          <w:szCs w:val="22"/>
+        </w:rPr>
+        <w:t xml:space="preserve">I confirm that this assignment is my own work.  </w:t>
+      </w:r>
+    </w:p>
+    <w:p>
+      <w:pPr>
+        <w:rPr>
+          <w:rFonts w:ascii="Arial" w:hAnsi="Arial" w:cs="Arial"/>
+          <w:sz w:val="22"/>
+          <w:szCs w:val="22"/>
+        </w:rPr>
+      </w:pPr>
+      <w:r>
+        <w:rPr>
+          <w:rFonts w:ascii="Arial" w:hAnsi="Arial" w:cs="Arial"/>
+          <w:sz w:val="22"/>
+          <w:szCs w:val="22"/>
+        </w:rPr>
+        <w:t>Where I/we have referred to academic sources, I have provided in-text citations and included the sources in the final reference list.</w:t>
+      </w:r>
+    </w:p>
+    <w:p>
+      <w:pPr>
+        <w:pStyle w:val="ListParagraph"/>
+        <w:numPr>
+          <w:ilvl w:val="2"/>
+          <w:numId w:val="1"/>
+        </w:numPr>
+        <w:spacing w:before="60" w:after="120" w:line="240" w:lineRule="auto"/>
+        <w:rPr>
+          <w:rFonts w:eastAsia="Arial" w:cs="Arial"/>
+          <w:color w:val="000000" w:themeColor="text1"/>
+          <w:sz w:val="22"/>
+        </w:rPr>
+      </w:pPr>
+      <w:r>
+        <w:rPr>
+          <w:rFonts w:eastAsia="Arial" w:cs="Arial"/>
+          <w:color w:val="000000" w:themeColor="text1"/>
+          <w:sz w:val="22"/>
+          <w:lang w:val="fr-FR"/>
+        </w:rPr>
+        <w:t>Module Code</w:t>
+      </w:r>
+      <w:r>
+        <w:rPr>
+          <w:rFonts w:eastAsia="Arial" w:cs="Arial"/>
+          <w:color w:val="000000" w:themeColor="text1"/>
+          <w:sz w:val="22"/>
+          <w:lang w:val="fr-FR"/>
+        </w:rPr>
+        <w:t> :</w:t>
+      </w:r>
+      <w:r>
+        <w:rPr>
+          <w:rFonts w:eastAsia="Arial" w:cs="Arial"/>
+          <w:color w:val="000000" w:themeColor="text1"/>
+          <w:sz w:val="22"/>
+          <w:lang w:val="fr-FR"/>
+        </w:rPr>
+        <w:t xml:space="preserve"> FC72</w:t>
+      </w:r>
+      <w:r>
+        <w:rPr>
+          <w:rFonts w:eastAsia="Arial" w:cs="Arial"/>
+          <w:color w:val="000000" w:themeColor="text1"/>
+          <w:sz w:val="22"/>
+          <w:lang w:val="fr-FR"/>
+        </w:rPr>
+        <w:t>3</w:t>
+      </w:r>
+    </w:p>
+    <w:p>
+      <w:pPr>
+        <w:pStyle w:val="ListParagraph"/>
+        <w:numPr>
+          <w:ilvl w:val="2"/>
+          <w:numId w:val="1"/>
+        </w:numPr>
+        <w:spacing w:before="60" w:after="120" w:line="240" w:lineRule="auto"/>
+        <w:rPr>
+          <w:rFonts w:eastAsia="Arial" w:cs="Arial"/>
+          <w:color w:val="000000" w:themeColor="text1"/>
+          <w:sz w:val="22"/>
+        </w:rPr>
+      </w:pPr>
+      <w:r>
+        <w:rPr>
+          <w:rFonts w:eastAsia="Arial" w:cs="Arial"/>
+          <w:color w:val="000000" w:themeColor="text1"/>
+          <w:sz w:val="22"/>
+        </w:rPr>
+        <w:t xml:space="preserve">Class/Group: Group </w:t>
+      </w:r>
+      <w:r>
+        <w:rPr>
+          <w:rFonts w:eastAsia="Arial" w:cs="Arial"/>
+          <w:color w:val="000000" w:themeColor="text1"/>
+          <w:sz w:val="22"/>
+        </w:rPr>
+        <w:t>1</w:t>
+      </w:r>
+    </w:p>
+    <w:p>
+      <w:pPr>
+        <w:pStyle w:val="ListParagraph"/>
+        <w:numPr>
+          <w:ilvl w:val="2"/>
+          <w:numId w:val="1"/>
+        </w:numPr>
+        <w:spacing w:before="60" w:after="120" w:line="240" w:lineRule="auto"/>
+        <w:rPr>
+          <w:rFonts w:eastAsia="Arial" w:cs="Arial"/>
+          <w:color w:val="000000" w:themeColor="text1"/>
+          <w:sz w:val="22"/>
+        </w:rPr>
+      </w:pPr>
+      <w:r>
+        <w:rPr>
+          <w:rFonts w:eastAsia="Arial" w:cs="Arial"/>
+          <w:color w:val="000000" w:themeColor="text1"/>
+          <w:sz w:val="22"/>
+        </w:rPr>
+        <w:t>Module Title</w:t>
+      </w:r>
+      <w:r>
+        <w:rPr>
+          <w:rFonts w:eastAsia="Arial" w:cs="Arial"/>
+          <w:color w:val="000000" w:themeColor="text1"/>
+          <w:sz w:val="22"/>
+        </w:rPr>
+        <w:t xml:space="preserve">: </w:t>
+      </w:r>
+      <w:r>
+        <w:rPr>
+          <w:rFonts w:eastAsia="Arial" w:cs="Arial"/>
+          <w:color w:val="000000" w:themeColor="text1"/>
+          <w:sz w:val="22"/>
+        </w:rPr>
+        <w:t xml:space="preserve">Programming </w:t>
+      </w:r>
+      <w:r>
+        <w:rPr>
+          <w:rFonts w:eastAsia="Arial" w:cs="Arial"/>
+          <w:color w:val="000000" w:themeColor="text1"/>
+          <w:sz w:val="22"/>
+        </w:rPr>
+        <w:t>Theory</w:t>
+      </w:r>
+    </w:p>
+    <w:p>
+      <w:pPr>
+        <w:pStyle w:val="ListParagraph"/>
+        <w:numPr>
+          <w:ilvl w:val="2"/>
+          <w:numId w:val="1"/>
+        </w:numPr>
+        <w:spacing w:before="60" w:after="120" w:line="240" w:lineRule="auto"/>
+        <w:rPr>
+          <w:rFonts w:eastAsia="Arial" w:cs="Arial"/>
+          <w:color w:val="000000" w:themeColor="text1"/>
+          <w:sz w:val="22"/>
+        </w:rPr>
+      </w:pPr>
+      <w:r>
+        <w:rPr>
+          <w:rFonts w:eastAsia="Arial" w:cs="Arial"/>
+          <w:color w:val="000000" w:themeColor="text1"/>
+          <w:sz w:val="22"/>
+        </w:rPr>
+        <w:t>Assessment Title</w:t>
+      </w:r>
+      <w:r>
+        <w:rPr>
+          <w:rFonts w:eastAsia="Arial" w:cs="Arial"/>
+          <w:color w:val="000000" w:themeColor="text1"/>
+          <w:sz w:val="22"/>
+        </w:rPr>
+        <w:t xml:space="preserve">: </w:t>
+      </w:r>
+      <w:r>
+        <w:rPr>
+          <w:rFonts w:eastAsia="Arial" w:cs="Arial"/>
+          <w:color w:val="000000" w:themeColor="text1"/>
+          <w:sz w:val="22"/>
+        </w:rPr>
+        <w:t>Portfolio</w:t>
+      </w:r>
+      <w:r>
+        <w:rPr>
+          <w:rFonts w:eastAsia="Arial" w:cs="Arial"/>
+          <w:color w:val="000000" w:themeColor="text1"/>
+          <w:sz w:val="22"/>
+        </w:rPr>
+        <w:t xml:space="preserve"> Project</w:t>
+      </w:r>
+      <w:r>
+        <w:rPr>
+          <w:rFonts w:eastAsia="Arial" w:cs="Arial"/>
+          <w:color w:val="000000" w:themeColor="text1"/>
+          <w:sz w:val="22"/>
+        </w:rPr>
+        <w:t xml:space="preserve"> 1</w:t>
+      </w:r>
+    </w:p>
+    <w:p>
+      <w:pPr>
+        <w:pStyle w:val="ListParagraph"/>
+        <w:numPr>
+          <w:ilvl w:val="2"/>
+          <w:numId w:val="1"/>
+        </w:numPr>
+        <w:spacing w:before="60" w:after="120" w:line="240" w:lineRule="auto"/>
+        <w:rPr>
+          <w:rFonts w:eastAsia="Arial" w:cs="Arial"/>
+          <w:color w:val="000000" w:themeColor="text1"/>
+          <w:sz w:val="22"/>
+        </w:rPr>
+      </w:pPr>
+      <w:r>
+        <w:rPr>
+          <w:rFonts w:eastAsia="Arial" w:cs="Arial"/>
+          <w:color w:val="000000" w:themeColor="text1"/>
+          <w:sz w:val="22"/>
+        </w:rPr>
+        <w:t xml:space="preserve">Tutor Name: </w:t>
+      </w:r>
+      <w:r>
+        <w:rPr>
+          <w:rFonts w:eastAsia="Arial" w:cs="Arial"/>
+          <w:color w:val="000000" w:themeColor="text1"/>
+          <w:sz w:val="22"/>
+        </w:rPr>
+        <w:t>Sophie Norman</w:t>
+      </w:r>
+    </w:p>
+    <w:p>
+      <w:pPr>
+        <w:pStyle w:val="ListParagraph"/>
+        <w:numPr>
+          <w:ilvl w:val="2"/>
+          <w:numId w:val="1"/>
+        </w:numPr>
+        <w:spacing w:before="60" w:after="120" w:line="240" w:lineRule="auto"/>
+        <w:rPr>
+          <w:rFonts w:eastAsia="Arial" w:cs="Arial"/>
+          <w:color w:val="000000" w:themeColor="text1"/>
+          <w:sz w:val="22"/>
+        </w:rPr>
+      </w:pPr>
+      <w:r>
+        <w:rPr>
+          <w:rFonts w:eastAsia="Arial" w:cs="Arial"/>
+          <w:color w:val="000000" w:themeColor="text1"/>
+          <w:sz w:val="22"/>
+        </w:rPr>
+        <w:t xml:space="preserve">Student GUID Number: </w:t>
+      </w:r>
+      <w:r>
+        <w:rPr>
+          <w:rFonts w:eastAsia="Arial" w:cs="Arial"/>
+          <w:color w:val="000000" w:themeColor="text1"/>
+          <w:sz w:val="22"/>
+        </w:rPr>
+        <w:t>3075302</w:t>
+      </w:r>
+    </w:p>
+    <w:p>
+      <w:pPr>
+        <w:pStyle w:val="ListParagraph"/>
+        <w:numPr>
+          <w:ilvl w:val="2"/>
+          <w:numId w:val="1"/>
+        </w:numPr>
+        <w:spacing w:before="60" w:after="120" w:line="240" w:lineRule="auto"/>
+        <w:rPr>
+          <w:rFonts w:eastAsia="Arial" w:cs="Arial"/>
+          <w:color w:val="000000" w:themeColor="text1"/>
+          <w:sz w:val="22"/>
+        </w:rPr>
+      </w:pPr>
+      <w:r>
+        <w:rPr>
+          <w:rFonts w:eastAsia="Arial" w:cs="Arial"/>
+          <w:color w:val="000000" w:themeColor="text1"/>
+          <w:sz w:val="22"/>
+        </w:rPr>
+        <w:t>P Number: P428245</w:t>
+      </w:r>
+    </w:p>
+    <w:p>
+      <w:pPr>
+        <w:pStyle w:val="ListParagraph"/>
+        <w:numPr>
+          <w:ilvl w:val="2"/>
+          <w:numId w:val="1"/>
+        </w:numPr>
+        <w:spacing w:before="60" w:after="120" w:line="240" w:lineRule="auto"/>
+        <w:rPr>
+          <w:rFonts w:eastAsia="Arial" w:cs="Arial"/>
+          <w:color w:val="000000" w:themeColor="text1"/>
+          <w:sz w:val="22"/>
+        </w:rPr>
+      </w:pPr>
+      <w:r>
+        <w:rPr>
+          <w:rFonts w:eastAsia="Arial" w:cs="Arial"/>
+          <w:color w:val="000000" w:themeColor="text1"/>
+          <w:sz w:val="22"/>
+        </w:rPr>
+        <w:t xml:space="preserve">Date of Submission: </w:t>
+      </w:r>
+      <w:r>
+        <w:rPr>
+          <w:rFonts w:eastAsia="Arial" w:cs="Arial"/>
+          <w:color w:val="000000" w:themeColor="text1"/>
+          <w:sz w:val="22"/>
+        </w:rPr>
+        <w:t>29 MAR 2026</w:t>
+      </w:r>
+    </w:p>
+    <w:p>
+      <w:pPr>
+        <w:rPr>
+          <w:lang w:val="en-US"/>
+        </w:rPr>
+      </w:pPr>
+    </w:p>
+    <w:p>
+      <w:pPr>
+        <w:rPr>
+          <w:rStyle w:val="normaltextrun"/>
+          <w:rFonts w:cs="Arial"/>
+          <w:color w:val="393839"/>
+          <w:u w:val="single"/>
+        </w:rPr>
+      </w:pPr>
+      <w:r>
+        <w:rPr>
+          <w:rStyle w:val="normaltextrun"/>
+          <w:rFonts w:cs="Arial"/>
+          <w:color w:val="393839"/>
+          <w:u w:val="single"/>
+        </w:rPr>
+        <w:t>P</w:t>
+      </w:r>
+      <w:r>
+        <w:rPr>
+          <w:rStyle w:val="normaltextrun"/>
+          <w:rFonts w:cs="Arial"/>
+          <w:color w:val="393839"/>
+          <w:u w:val="single"/>
+        </w:rPr>
+        <w:t>seudocode of the Euclidean Algorithm</w:t>
+      </w:r>
+    </w:p>
+    <w:p>
+      <w:pPr>
+        <w:tabs>
+          <w:tab w:val="left" w:pos="796"/>
+        </w:tabs>
+        <w:rPr>
+          <w:lang w:val="en-US"/>
+        </w:rPr>
+      </w:pPr>
+      <w:r>
+        <w:rPr>
+          <w:rStyle w:val="normaltextrun"/>
+          <w:rFonts w:cs="Arial"/>
+          <w:color w:val="393839"/>
+        </w:rPr>
+        <w:t>1.</w:t>
+      </w:r>
+    </w:p>
+    <w:p>
+      <w:pPr>
         <w:rPr>
           <w:lang w:val="en-US"/>
         </w:rPr>
@@ -129,7 +518,7 @@
         <w:rPr>
           <w:lang w:val="en-US"/>
         </w:rPr>
-        <w:t>% (</w:t>
+        <w:t>%(</w:t>
       </w:r>
       <w:r>
         <w:rPr>
@@ -301,96 +690,223 @@
         <w:rPr>
           <w:lang w:val="en-US"/>
         </w:rPr>
-        <w:t xml:space="preserve">from the last </w:t>
+        <w:t>from the last loop</w:t>
+      </w:r>
+      <w:r>
+        <w:rPr>
+          <w:lang w:val="en-US"/>
+        </w:rPr>
+        <w:t>,</w:t>
+      </w:r>
+      <w:r>
+        <w:rPr>
+          <w:lang w:val="en-US"/>
+        </w:rPr>
+        <w:t xml:space="preserve"> </w:t>
+      </w:r>
+      <w:r>
+        <w:rPr>
+          <w:lang w:val="en-US"/>
+        </w:rPr>
+        <w:t>which bigger input in current situation</w:t>
+      </w:r>
+      <w:r>
+        <w:rPr>
+          <w:lang w:val="en-US"/>
+        </w:rPr>
+        <w:t xml:space="preserve"> </w:t>
+      </w:r>
+      <w:r>
+        <w:rPr>
+          <w:lang w:val="en-US"/>
+        </w:rPr>
+        <w:t>will be the GCD</w:t>
+      </w:r>
+      <w:r>
+        <w:rPr>
+          <w:lang w:val="en-US"/>
+        </w:rPr>
+        <w:t>.</w:t>
+      </w:r>
+    </w:p>
+    <w:p>
+      <w:pPr>
+        <w:rPr>
+          <w:lang w:val="en-US"/>
+        </w:rPr>
+      </w:pPr>
+    </w:p>
+    <w:p>
+      <w:pPr>
+        <w:rPr>
+          <w:lang w:val="en-US"/>
+        </w:rPr>
+      </w:pPr>
+    </w:p>
+    <w:p>
+      <w:pPr>
+        <w:rPr>
+          <w:lang w:val="en-US"/>
+        </w:rPr>
+      </w:pPr>
+      <w:r>
+        <w:rPr>
+          <w:lang w:val="en-US"/>
+        </w:rPr>
+        <w:t>5.</w:t>
+      </w:r>
+      <w:r>
+        <w:rPr>
+          <w:lang w:val="en-US"/>
+        </w:rPr>
+        <w:t xml:space="preserve"> I commit to the git after I done some new function</w:t>
+      </w:r>
+      <w:r>
+        <w:rPr>
+          <w:lang w:val="en-US"/>
+        </w:rPr>
+        <w:t>, fix bugs or</w:t>
+      </w:r>
+      <w:r>
+        <w:rPr>
+          <w:lang w:val="en-US"/>
+        </w:rPr>
+        <w:t xml:space="preserve"> </w:t>
+      </w:r>
+      <w:r>
+        <w:rPr>
+          <w:lang w:val="en-US"/>
+        </w:rPr>
+        <w:t xml:space="preserve">refactor the code. </w:t>
+      </w:r>
+    </w:p>
+    <w:p>
+      <w:pPr>
+        <w:rPr>
+          <w:lang w:val="en-US"/>
+        </w:rPr>
+      </w:pPr>
+      <w:r>
+        <w:rPr>
+          <w:lang w:val="en-US"/>
+        </w:rPr>
+        <w:t xml:space="preserve">I can </w:t>
       </w:r>
       <w:proofErr w:type="gramStart"/>
       <w:r>
         <w:rPr>
           <w:lang w:val="en-US"/>
         </w:rPr>
-        <w:t>loop</w:t>
-      </w:r>
+        <w:t>found</w:t>
+      </w:r>
+      <w:proofErr w:type="gramEnd"/>
+      <w:r>
+        <w:rPr>
+          <w:lang w:val="en-US"/>
+        </w:rPr>
+        <w:t xml:space="preserve"> my changes in main, then </w:t>
+      </w:r>
+      <w:r>
+        <w:rPr>
+          <w:lang w:val="en-US"/>
+        </w:rPr>
+        <w:t>my ‘.</w:t>
+      </w:r>
+      <w:proofErr w:type="spellStart"/>
+      <w:r>
+        <w:rPr>
+          <w:lang w:val="en-US"/>
+        </w:rPr>
+        <w:t>py</w:t>
+      </w:r>
+      <w:proofErr w:type="spellEnd"/>
+      <w:r>
+        <w:rPr>
+          <w:lang w:val="en-US"/>
+        </w:rPr>
+        <w:t>’ file, history</w:t>
+      </w:r>
+      <w:r>
+        <w:rPr>
+          <w:lang w:val="en-US"/>
+        </w:rPr>
+        <w:t xml:space="preserve">. I can find difference of </w:t>
+      </w:r>
+      <w:r>
+        <w:rPr>
+          <w:lang w:val="en-US"/>
+        </w:rPr>
+        <w:t>each of my commit here.</w:t>
+      </w:r>
+    </w:p>
+    <w:p>
+      <w:pPr>
+        <w:rPr>
+          <w:lang w:val="en-US"/>
+        </w:rPr>
+      </w:pPr>
+      <w:hyperlink r:id="rId5" w:history="1">
+        <w:r>
+          <w:rPr>
+            <w:rStyle w:val="Hyperlink"/>
+            <w:lang w:val="en-US"/>
+          </w:rPr>
+          <w:t>https://github.com/Simon1130/FC723-Portfolio-Assig</w:t>
+        </w:r>
+        <w:r>
+          <w:rPr>
+            <w:rStyle w:val="Hyperlink"/>
+            <w:lang w:val="en-US"/>
+          </w:rPr>
+          <w:t>n</w:t>
+        </w:r>
+        <w:r>
+          <w:rPr>
+            <w:rStyle w:val="Hyperlink"/>
+            <w:lang w:val="en-US"/>
+          </w:rPr>
+          <w:t>ment-1/tree/</w:t>
+        </w:r>
+        <w:r>
+          <w:rPr>
+            <w:rStyle w:val="Hyperlink"/>
+            <w:lang w:val="en-US"/>
+          </w:rPr>
+          <w:t>m</w:t>
+        </w:r>
+        <w:r>
+          <w:rPr>
+            <w:rStyle w:val="Hyperlink"/>
+            <w:lang w:val="en-US"/>
+          </w:rPr>
+          <w:t>ain</w:t>
+        </w:r>
+      </w:hyperlink>
       <w:r>
         <w:rPr>
           <w:lang w:val="en-US"/>
         </w:rPr>
         <w:t xml:space="preserve"> </w:t>
       </w:r>
-      <w:r>
-        <w:rPr>
-          <w:lang w:val="en-US"/>
-        </w:rPr>
-        <w:t>,</w:t>
-      </w:r>
-      <w:proofErr w:type="gramEnd"/>
-      <w:r>
-        <w:rPr>
-          <w:lang w:val="en-US"/>
-        </w:rPr>
-        <w:t xml:space="preserve"> </w:t>
-      </w:r>
-      <w:r>
-        <w:rPr>
-          <w:lang w:val="en-US"/>
-        </w:rPr>
-        <w:t>which bigger input in current situation</w:t>
-      </w:r>
-      <w:r>
-        <w:rPr>
-          <w:lang w:val="en-US"/>
-        </w:rPr>
-        <w:t xml:space="preserve"> </w:t>
-      </w:r>
-      <w:r>
-        <w:rPr>
-          <w:lang w:val="en-US"/>
-        </w:rPr>
-        <w:t>will be the GCD</w:t>
-      </w:r>
-      <w:r>
-        <w:rPr>
-          <w:lang w:val="en-US"/>
-        </w:rPr>
-        <w:t>.</w:t>
-      </w:r>
-    </w:p>
-    <w:p>
-      <w:pPr>
-        <w:rPr>
-          <w:lang w:val="en-US"/>
-        </w:rPr>
-      </w:pPr>
-    </w:p>
-    <w:p>
-      <w:pPr>
-        <w:rPr>
-          <w:lang w:val="en-US"/>
-        </w:rPr>
-      </w:pPr>
-    </w:p>
-    <w:p>
-      <w:pPr>
-        <w:rPr>
-          <w:lang w:val="en-US"/>
-        </w:rPr>
-      </w:pPr>
-      <w:r>
-        <w:rPr>
-          <w:lang w:val="en-US"/>
-        </w:rPr>
-        <w:t>5.</w:t>
-      </w:r>
-    </w:p>
-    <w:p>
-      <w:pPr>
-        <w:rPr>
-          <w:lang w:val="en-US"/>
-        </w:rPr>
-      </w:pPr>
-      <w:r>
-        <w:rPr>
-          <w:lang w:val="en-US"/>
-        </w:rPr>
+    </w:p>
+    <w:p>
+      <w:pPr>
+        <w:rPr>
+          <w:lang w:val="en-US"/>
+        </w:rPr>
+      </w:pPr>
+    </w:p>
+    <w:p>
+      <w:pPr>
+        <w:rPr>
+          <w:lang w:val="en-US"/>
+        </w:rPr>
+      </w:pPr>
+      <w:r>
+        <w:rPr>
+          <w:lang w:val="en-US"/>
+        </w:rPr>
+        <w:lastRenderedPageBreak/>
         <w:t>6.</w:t>
       </w:r>
     </w:p>
@@ -402,6 +918,127 @@
     </w:sectPr>
   </w:body>
 </w:document>
+</file>
+
+<file path=word/numbering.xml><?xml version="1.0" encoding="utf-8"?>
+<w:numbering xmlns:wpc="http://schemas.microsoft.com/office/word/2010/wordprocessingCanvas" xmlns:cx="http://schemas.microsoft.com/office/drawing/2014/chartex" xmlns:cx1="http://schemas.microsoft.com/office/drawing/2015/9/8/chartex" xmlns:cx2="http://schemas.microsoft.com/office/drawing/2015/10/21/chartex" xmlns:cx3="http://schemas.microsoft.com/office/drawing/2016/5/9/chartex" xmlns:cx4="http://schemas.microsoft.com/office/drawing/2016/5/10/chartex" xmlns:cx5="http://schemas.microsoft.com/office/drawing/2016/5/11/chartex" xmlns:cx6="http://schemas.microsoft.com/office/drawing/2016/5/12/chartex" xmlns:cx7="http://schemas.microsoft.com/office/drawing/2016/5/13/chartex" xmlns:cx8="http://schemas.microsoft.com/office/drawing/2016/5/14/chartex" xmlns:mc="http://schemas.openxmlformats.org/markup-compatibility/2006" xmlns:aink="http://schemas.microsoft.com/office/drawing/2016/ink" xmlns:am3d="http://schemas.microsoft.com/office/drawing/2017/model3d" xmlns:o="urn:schemas-microsoft-com:office:office" xmlns:oel="http://schemas.microsoft.com/office/2019/extlst" xmlns:r="http://schemas.openxmlformats.org/officeDocument/2006/relationships" xmlns:m="http://schemas.openxmlformats.org/officeDocument/2006/math" xmlns:v="urn:schemas-microsoft-com:vml" xmlns:wp14="http://schemas.microsoft.com/office/word/2010/wordprocessingDrawing" xmlns:wp="http://schemas.openxmlformats.org/drawingml/2006/wordprocessingDrawing" xmlns:w10="urn:schemas-microsoft-com:office:word" xmlns:w="http://schemas.openxmlformats.org/wordprocessingml/2006/main" xmlns:w14="http://schemas.microsoft.com/office/word/2010/wordml" xmlns:w15="http://schemas.microsoft.com/office/word/2012/wordml" xmlns:w16cex="http://schemas.microsoft.com/office/word/2018/wordml/cex" xmlns:w16cid="http://schemas.microsoft.com/office/word/2016/wordml/cid" xmlns:w16="http://schemas.microsoft.com/office/word/2018/wordml" xmlns:w16du="http://schemas.microsoft.com/office/word/2023/wordml/word16du" xmlns:w16sdtdh="http://schemas.microsoft.com/office/word/2020/wordml/sdtdatahash" xmlns:w16sdtfl="http://schemas.microsoft.com/office/word/2024/wordml/sdtformatlock" xmlns:w16se="http://schemas.microsoft.com/office/word/2015/wordml/symex" xmlns:wpg="http://schemas.microsoft.com/office/word/2010/wordprocessingGroup" xmlns:wpi="http://schemas.microsoft.com/office/word/2010/wordprocessingInk" xmlns:wne="http://schemas.microsoft.com/office/word/2006/wordml" xmlns:wps="http://schemas.microsoft.com/office/word/2010/wordprocessingShape" mc:Ignorable="w14 w15 w16se w16cid w16 w16cex w16sdtdh w16sdtfl w16du wp14">
+  <w:abstractNum w:abstractNumId="0" w15:restartNumberingAfterBreak="0">
+    <w:nsid w:val="67C249D2"/>
+    <w:multiLevelType w:val="hybridMultilevel"/>
+    <w:tmpl w:val="6A4C4A42"/>
+    <w:lvl w:ilvl="0" w:tplc="507C09DE">
+      <w:start w:val="1"/>
+      <w:numFmt w:val="bullet"/>
+      <w:lvlText w:val=""/>
+      <w:lvlJc w:val="left"/>
+      <w:pPr>
+        <w:ind w:left="720" w:hanging="360"/>
+      </w:pPr>
+      <w:rPr>
+        <w:rFonts w:ascii="Symbol" w:hAnsi="Symbol" w:hint="default"/>
+      </w:rPr>
+    </w:lvl>
+    <w:lvl w:ilvl="1" w:tplc="DF14B1A8">
+      <w:start w:val="1"/>
+      <w:numFmt w:val="bullet"/>
+      <w:lvlText w:val="o"/>
+      <w:lvlJc w:val="left"/>
+      <w:pPr>
+        <w:ind w:left="1440" w:hanging="360"/>
+      </w:pPr>
+      <w:rPr>
+        <w:rFonts w:ascii="Courier New" w:hAnsi="Courier New" w:hint="default"/>
+      </w:rPr>
+    </w:lvl>
+    <w:lvl w:ilvl="2" w:tplc="F4A4FD16">
+      <w:start w:val="1"/>
+      <w:numFmt w:val="bullet"/>
+      <w:lvlText w:val=""/>
+      <w:lvlJc w:val="left"/>
+      <w:pPr>
+        <w:ind w:left="2160" w:hanging="360"/>
+      </w:pPr>
+      <w:rPr>
+        <w:rFonts w:ascii="Symbol" w:hAnsi="Symbol" w:hint="default"/>
+      </w:rPr>
+    </w:lvl>
+    <w:lvl w:ilvl="3" w:tplc="C214F54C">
+      <w:start w:val="1"/>
+      <w:numFmt w:val="bullet"/>
+      <w:lvlText w:val=""/>
+      <w:lvlJc w:val="left"/>
+      <w:pPr>
+        <w:ind w:left="2880" w:hanging="360"/>
+      </w:pPr>
+      <w:rPr>
+        <w:rFonts w:ascii="Symbol" w:hAnsi="Symbol" w:hint="default"/>
+      </w:rPr>
+    </w:lvl>
+    <w:lvl w:ilvl="4" w:tplc="FF0E896C">
+      <w:start w:val="1"/>
+      <w:numFmt w:val="bullet"/>
+      <w:lvlText w:val="o"/>
+      <w:lvlJc w:val="left"/>
+      <w:pPr>
+        <w:ind w:left="3600" w:hanging="360"/>
+      </w:pPr>
+      <w:rPr>
+        <w:rFonts w:ascii="Courier New" w:hAnsi="Courier New" w:hint="default"/>
+      </w:rPr>
+    </w:lvl>
+    <w:lvl w:ilvl="5" w:tplc="82BE4D64">
+      <w:start w:val="1"/>
+      <w:numFmt w:val="bullet"/>
+      <w:lvlText w:val=""/>
+      <w:lvlJc w:val="left"/>
+      <w:pPr>
+        <w:ind w:left="4320" w:hanging="360"/>
+      </w:pPr>
+      <w:rPr>
+        <w:rFonts w:ascii="Wingdings" w:hAnsi="Wingdings" w:hint="default"/>
+      </w:rPr>
+    </w:lvl>
+    <w:lvl w:ilvl="6" w:tplc="77B4BEBA">
+      <w:start w:val="1"/>
+      <w:numFmt w:val="bullet"/>
+      <w:lvlText w:val=""/>
+      <w:lvlJc w:val="left"/>
+      <w:pPr>
+        <w:ind w:left="5040" w:hanging="360"/>
+      </w:pPr>
+      <w:rPr>
+        <w:rFonts w:ascii="Symbol" w:hAnsi="Symbol" w:hint="default"/>
+      </w:rPr>
+    </w:lvl>
+    <w:lvl w:ilvl="7" w:tplc="948C2202">
+      <w:start w:val="1"/>
+      <w:numFmt w:val="bullet"/>
+      <w:lvlText w:val="o"/>
+      <w:lvlJc w:val="left"/>
+      <w:pPr>
+        <w:ind w:left="5760" w:hanging="360"/>
+      </w:pPr>
+      <w:rPr>
+        <w:rFonts w:ascii="Courier New" w:hAnsi="Courier New" w:hint="default"/>
+      </w:rPr>
+    </w:lvl>
+    <w:lvl w:ilvl="8" w:tplc="032E6E1E">
+      <w:start w:val="1"/>
+      <w:numFmt w:val="bullet"/>
+      <w:lvlText w:val=""/>
+      <w:lvlJc w:val="left"/>
+      <w:pPr>
+        <w:ind w:left="6480" w:hanging="360"/>
+      </w:pPr>
+      <w:rPr>
+        <w:rFonts w:ascii="Wingdings" w:hAnsi="Wingdings" w:hint="default"/>
+      </w:rPr>
+    </w:lvl>
+  </w:abstractNum>
+  <w:num w:numId="1" w16cid:durableId="1903178278">
+    <w:abstractNumId w:val="0"/>
+  </w:num>
+</w:numbering>
 </file>
 
 <file path=word/styles.xml><?xml version="1.0" encoding="utf-8"?>
@@ -1321,6 +1958,62 @@
       <w:spacing w:val="5"/>
     </w:rPr>
   </w:style>
+  <w:style w:type="paragraph" w:styleId="NormalWeb">
+    <w:name w:val="Normal (Web)"/>
+    <w:basedOn w:val="Normal"/>
+    <w:uiPriority w:val="99"/>
+    <w:semiHidden/>
+    <w:unhideWhenUsed/>
+    <w:rsid w:val="009915BC"/>
+    <w:pPr>
+      <w:spacing w:before="100" w:beforeAutospacing="1" w:after="100" w:afterAutospacing="1" w:line="240" w:lineRule="auto"/>
+    </w:pPr>
+    <w:rPr>
+      <w:rFonts w:ascii="Times New Roman" w:eastAsia="Times New Roman" w:hAnsi="Times New Roman" w:cs="Times New Roman"/>
+      <w:kern w:val="0"/>
+      <w:lang w:val="en-GB" w:eastAsia="en-GB"/>
+      <w14:ligatures w14:val="none"/>
+    </w:rPr>
+  </w:style>
+  <w:style w:type="character" w:customStyle="1" w:styleId="normaltextrun">
+    <w:name w:val="normaltextrun"/>
+    <w:rsid w:val="00F05009"/>
+  </w:style>
+  <w:style w:type="character" w:styleId="Hyperlink">
+    <w:name w:val="Hyperlink"/>
+    <w:basedOn w:val="DefaultParagraphFont"/>
+    <w:uiPriority w:val="99"/>
+    <w:unhideWhenUsed/>
+    <w:rsid w:val="009D2C94"/>
+    <w:rPr>
+      <w:color w:val="467886" w:themeColor="hyperlink"/>
+      <w:u w:val="single"/>
+    </w:rPr>
+  </w:style>
+  <w:style w:type="character" w:styleId="UnresolvedMention">
+    <w:name w:val="Unresolved Mention"/>
+    <w:basedOn w:val="DefaultParagraphFont"/>
+    <w:uiPriority w:val="99"/>
+    <w:semiHidden/>
+    <w:unhideWhenUsed/>
+    <w:rsid w:val="009D2C94"/>
+    <w:rPr>
+      <w:color w:val="605E5C"/>
+      <w:shd w:val="clear" w:color="auto" w:fill="E1DFDD"/>
+    </w:rPr>
+  </w:style>
+  <w:style w:type="character" w:styleId="FollowedHyperlink">
+    <w:name w:val="FollowedHyperlink"/>
+    <w:basedOn w:val="DefaultParagraphFont"/>
+    <w:uiPriority w:val="99"/>
+    <w:semiHidden/>
+    <w:unhideWhenUsed/>
+    <w:rsid w:val="005659F2"/>
+    <w:rPr>
+      <w:color w:val="96607D" w:themeColor="followedHyperlink"/>
+      <w:u w:val="single"/>
+    </w:rPr>
+  </w:style>
 </w:styles>
 </file>
 

</xml_diff>

<commit_message>
adding one more check
check if both of the inputs are positive
</commit_message>
<xml_diff>
--- a/FC723 Portfolio Project 1 pseudocode.docx
+++ b/FC723 Portfolio Project 1 pseudocode.docx
@@ -361,16 +361,27 @@
           <w:color w:val="393839"/>
           <w:u w:val="single"/>
         </w:rPr>
-        <w:t>P</w:t>
-      </w:r>
-      <w:r>
+        <w:t>Pseudocode of the Euclidean Algorithm</w:t>
+      </w:r>
+    </w:p>
+    <w:p>
+      <w:pPr>
+        <w:tabs>
+          <w:tab w:val="left" w:pos="796"/>
+        </w:tabs>
         <w:rPr>
           <w:rStyle w:val="normaltextrun"/>
           <w:rFonts w:cs="Arial"/>
           <w:color w:val="393839"/>
-          <w:u w:val="single"/>
-        </w:rPr>
-        <w:t>seudocode of the Euclidean Algorithm</w:t>
+        </w:rPr>
+      </w:pPr>
+      <w:r>
+        <w:rPr>
+          <w:rStyle w:val="normaltextrun"/>
+          <w:rFonts w:cs="Arial"/>
+          <w:color w:val="393839"/>
+        </w:rPr>
+        <w:t>1.</w:t>
       </w:r>
     </w:p>
     <w:p>
@@ -388,7 +399,15 @@
           <w:rFonts w:cs="Arial"/>
           <w:color w:val="393839"/>
         </w:rPr>
-        <w:t>1.</w:t>
+        <w:t>Define function to fin</w:t>
+      </w:r>
+      <w:r>
+        <w:rPr>
+          <w:rStyle w:val="normaltextrun"/>
+          <w:rFonts w:cs="Arial"/>
+          <w:color w:val="393839"/>
+        </w:rPr>
+        <w:t>d GCD</w:t>
       </w:r>
     </w:p>
     <w:p>
@@ -426,6 +445,33 @@
         <w:rPr>
           <w:lang w:val="en-US"/>
         </w:rPr>
+        <w:t xml:space="preserve">Check if the input is integer, positive and </w:t>
+      </w:r>
+      <w:proofErr w:type="gramStart"/>
+      <w:r>
+        <w:rPr>
+          <w:lang w:val="en-US"/>
+        </w:rPr>
+        <w:t>both of them</w:t>
+      </w:r>
+      <w:proofErr w:type="gramEnd"/>
+      <w:r>
+        <w:rPr>
+          <w:lang w:val="en-US"/>
+        </w:rPr>
+        <w:t xml:space="preserve"> are not ‘0’</w:t>
+      </w:r>
+    </w:p>
+    <w:p>
+      <w:pPr>
+        <w:rPr>
+          <w:lang w:val="en-US"/>
+        </w:rPr>
+      </w:pPr>
+      <w:r>
+        <w:rPr>
+          <w:lang w:val="en-US"/>
+        </w:rPr>
         <w:t>C</w:t>
       </w:r>
       <w:r>
@@ -465,98 +511,6 @@
           <w:lang w:val="en-US"/>
         </w:rPr>
       </w:pPr>
-      <w:r>
-        <w:rPr>
-          <w:lang w:val="en-US"/>
-        </w:rPr>
-        <w:t xml:space="preserve">Quotient is </w:t>
-      </w:r>
-      <w:r>
-        <w:rPr>
-          <w:lang w:val="en-US"/>
-        </w:rPr>
-        <w:t xml:space="preserve">bigger input having </w:t>
-      </w:r>
-      <w:r>
-        <w:rPr>
-          <w:lang w:val="en-US"/>
-        </w:rPr>
-        <w:t>// (</w:t>
-      </w:r>
-      <w:r>
-        <w:rPr>
-          <w:lang w:val="en-US"/>
-        </w:rPr>
-        <w:t>integer division</w:t>
-      </w:r>
-      <w:r>
-        <w:rPr>
-          <w:lang w:val="en-US"/>
-        </w:rPr>
-        <w:t>)</w:t>
-      </w:r>
-      <w:r>
-        <w:rPr>
-          <w:lang w:val="en-US"/>
-        </w:rPr>
-        <w:t xml:space="preserve"> with smaller input</w:t>
-      </w:r>
-    </w:p>
-    <w:p>
-      <w:pPr>
-        <w:rPr>
-          <w:lang w:val="en-US"/>
-        </w:rPr>
-      </w:pPr>
-      <w:r>
-        <w:rPr>
-          <w:lang w:val="en-US"/>
-        </w:rPr>
-        <w:t xml:space="preserve">Remainder is the </w:t>
-      </w:r>
-      <w:r>
-        <w:rPr>
-          <w:lang w:val="en-US"/>
-        </w:rPr>
-        <w:t>%(</w:t>
-      </w:r>
-      <w:r>
-        <w:rPr>
-          <w:lang w:val="en-US"/>
-        </w:rPr>
-        <w:t>modul</w:t>
-      </w:r>
-      <w:r>
-        <w:rPr>
-          <w:lang w:val="en-US"/>
-        </w:rPr>
-        <w:t>u</w:t>
-      </w:r>
-      <w:r>
-        <w:rPr>
-          <w:lang w:val="en-US"/>
-        </w:rPr>
-        <w:t>s</w:t>
-      </w:r>
-      <w:r>
-        <w:rPr>
-          <w:lang w:val="en-US"/>
-        </w:rPr>
-        <w:t>)</w:t>
-      </w:r>
-      <w:r>
-        <w:rPr>
-          <w:lang w:val="en-US"/>
-        </w:rPr>
-        <w:t xml:space="preserve"> of bigger input divide smaller input</w:t>
-      </w:r>
-    </w:p>
-    <w:p>
-      <w:pPr>
-        <w:rPr>
-          <w:lang w:val="en-US"/>
-        </w:rPr>
-      </w:pPr>
     </w:p>
     <w:p>
       <w:pPr>
@@ -585,6 +539,32 @@
     </w:p>
     <w:p>
       <w:pPr>
+        <w:rPr>
+          <w:lang w:val="en-US"/>
+        </w:rPr>
+      </w:pPr>
+      <w:r>
+        <w:rPr>
+          <w:lang w:val="en-US"/>
+        </w:rPr>
+        <w:tab/>
+        <w:t xml:space="preserve">Remainder is the %(modulus) of bigger input divide </w:t>
+      </w:r>
+      <w:r>
+        <w:rPr>
+          <w:lang w:val="en-US"/>
+        </w:rPr>
+        <w:t xml:space="preserve">by </w:t>
+      </w:r>
+      <w:r>
+        <w:rPr>
+          <w:lang w:val="en-US"/>
+        </w:rPr>
+        <w:t>smaller input</w:t>
+      </w:r>
+    </w:p>
+    <w:p>
+      <w:pPr>
         <w:ind w:firstLine="720"/>
         <w:rPr>
           <w:lang w:val="en-US"/>
@@ -636,23 +616,42 @@
           <w:lang w:val="en-US"/>
         </w:rPr>
       </w:pPr>
-      <w:r>
-        <w:rPr>
-          <w:lang w:val="en-US"/>
-        </w:rPr>
-        <w:t xml:space="preserve">Then calculate new </w:t>
-      </w:r>
-      <w:r>
-        <w:rPr>
-          <w:lang w:val="en-US"/>
-        </w:rPr>
-        <w:t>r</w:t>
-      </w:r>
-      <w:r>
-        <w:rPr>
-          <w:lang w:val="en-US"/>
-        </w:rPr>
-        <w:t>emainder</w:t>
+    </w:p>
+    <w:p>
+      <w:pPr>
+        <w:rPr>
+          <w:lang w:val="en-US"/>
+        </w:rPr>
+      </w:pPr>
+      <w:r>
+        <w:rPr>
+          <w:lang w:val="en-US"/>
+        </w:rPr>
+        <w:t>Return b</w:t>
+      </w:r>
+      <w:r>
+        <w:rPr>
+          <w:lang w:val="en-US"/>
+        </w:rPr>
+        <w:t xml:space="preserve">igger input as </w:t>
+      </w:r>
+      <w:r>
+        <w:rPr>
+          <w:lang w:val="en-US"/>
+        </w:rPr>
+        <w:t xml:space="preserve">it </w:t>
+      </w:r>
+      <w:r>
+        <w:rPr>
+          <w:lang w:val="en-US"/>
+        </w:rPr>
+        <w:t>has</w:t>
+      </w:r>
+      <w:r>
+        <w:rPr>
+          <w:lang w:val="en-US"/>
+        </w:rPr>
+        <w:t xml:space="preserve"> the value of smaller input</w:t>
       </w:r>
     </w:p>
     <w:p>
@@ -708,13 +707,7 @@
         <w:rPr>
           <w:lang w:val="en-US"/>
         </w:rPr>
-        <w:t>which bigger input in current situation</w:t>
-      </w:r>
-      <w:r>
-        <w:rPr>
-          <w:lang w:val="en-US"/>
-        </w:rPr>
-        <w:t xml:space="preserve"> </w:t>
+        <w:t xml:space="preserve">which bigger input in current situation </w:t>
       </w:r>
       <w:r>
         <w:rPr>
@@ -849,35 +842,7 @@
             <w:rStyle w:val="Hyperlink"/>
             <w:lang w:val="en-US"/>
           </w:rPr>
-          <w:t>https://github.com/Simon1130/FC723-Portfolio-Assig</w:t>
-        </w:r>
-        <w:r>
-          <w:rPr>
-            <w:rStyle w:val="Hyperlink"/>
-            <w:lang w:val="en-US"/>
-          </w:rPr>
-          <w:t>n</w:t>
-        </w:r>
-        <w:r>
-          <w:rPr>
-            <w:rStyle w:val="Hyperlink"/>
-            <w:lang w:val="en-US"/>
-          </w:rPr>
-          <w:t>ment-1/tree/</w:t>
-        </w:r>
-        <w:r>
-          <w:rPr>
-            <w:rStyle w:val="Hyperlink"/>
-            <w:lang w:val="en-US"/>
-          </w:rPr>
-          <w:t>m</w:t>
-        </w:r>
-        <w:r>
-          <w:rPr>
-            <w:rStyle w:val="Hyperlink"/>
-            <w:lang w:val="en-US"/>
-          </w:rPr>
-          <w:t>ain</w:t>
+          <w:t>https://github.com/Simon1130/FC723-Portfolio-Assignment-1/tree/main</w:t>
         </w:r>
       </w:hyperlink>
       <w:r>
@@ -904,9 +869,172 @@
         <w:rPr>
           <w:lang w:val="en-US"/>
         </w:rPr>
-        <w:lastRenderedPageBreak/>
         <w:t>6.</w:t>
       </w:r>
+      <w:r>
+        <w:rPr>
+          <w:lang w:val="en-US"/>
+        </w:rPr>
+        <w:t xml:space="preserve"> </w:t>
+      </w:r>
+      <w:r>
+        <w:rPr>
+          <w:lang w:val="en-US"/>
+        </w:rPr>
+        <w:t xml:space="preserve">Printing bigger input, smaller input and the remainder for each loop to have a clear understanding of process. </w:t>
+      </w:r>
+    </w:p>
+    <w:p>
+      <w:pPr>
+        <w:rPr>
+          <w:lang w:val="en-US"/>
+        </w:rPr>
+      </w:pPr>
+    </w:p>
+    <w:p>
+      <w:pPr>
+        <w:rPr>
+          <w:lang w:val="en-US"/>
+        </w:rPr>
+      </w:pPr>
+      <w:r>
+        <w:rPr>
+          <w:lang w:val="en-US"/>
+        </w:rPr>
+        <w:t>Modify with</w:t>
+      </w:r>
+      <w:r>
+        <w:rPr>
+          <w:lang w:val="en-US"/>
+        </w:rPr>
+        <w:t xml:space="preserve"> the</w:t>
+      </w:r>
+      <w:r>
+        <w:rPr>
+          <w:lang w:val="en-US"/>
+        </w:rPr>
+        <w:t xml:space="preserve"> </w:t>
+      </w:r>
+      <w:r>
+        <w:rPr>
+          <w:lang w:val="en-US"/>
+        </w:rPr>
+        <w:t xml:space="preserve">GCD </w:t>
+      </w:r>
+      <w:r>
+        <w:rPr>
+          <w:lang w:val="en-US"/>
+        </w:rPr>
+        <w:t>function</w:t>
+      </w:r>
+      <w:r>
+        <w:rPr>
+          <w:lang w:val="en-US"/>
+        </w:rPr>
+        <w:t xml:space="preserve"> from question 1</w:t>
+      </w:r>
+      <w:r>
+        <w:rPr>
+          <w:lang w:val="en-US"/>
+        </w:rPr>
+        <w:t>. In the While loop</w:t>
+      </w:r>
+    </w:p>
+    <w:p>
+      <w:pPr>
+        <w:rPr>
+          <w:lang w:val="en-US"/>
+        </w:rPr>
+      </w:pPr>
+    </w:p>
+    <w:p>
+      <w:pPr>
+        <w:rPr>
+          <w:lang w:val="en-US"/>
+        </w:rPr>
+      </w:pPr>
+      <w:r>
+        <w:rPr>
+          <w:lang w:val="en-US"/>
+        </w:rPr>
+        <w:t>While the smaller input not equal to 0</w:t>
+      </w:r>
+    </w:p>
+    <w:p>
+      <w:pPr>
+        <w:rPr>
+          <w:lang w:val="en-US"/>
+        </w:rPr>
+      </w:pPr>
+      <w:r>
+        <w:rPr>
+          <w:lang w:val="en-US"/>
+        </w:rPr>
+        <w:tab/>
+        <w:t>Remainder is the %(modulus) of bigger input divide by smaller input</w:t>
+      </w:r>
+    </w:p>
+    <w:p>
+      <w:pPr>
+        <w:rPr>
+          <w:lang w:val="en-US"/>
+        </w:rPr>
+      </w:pPr>
+      <w:r>
+        <w:rPr>
+          <w:lang w:val="en-US"/>
+        </w:rPr>
+        <w:tab/>
+        <w:t>Print</w:t>
+      </w:r>
+      <w:r>
+        <w:rPr>
+          <w:lang w:val="en-US"/>
+        </w:rPr>
+        <w:t>ing bigger input, smaller input and the remainder</w:t>
+      </w:r>
+    </w:p>
+    <w:p>
+      <w:pPr>
+        <w:ind w:firstLine="720"/>
+        <w:rPr>
+          <w:lang w:val="en-US"/>
+        </w:rPr>
+      </w:pPr>
+      <w:r>
+        <w:rPr>
+          <w:lang w:val="en-US"/>
+        </w:rPr>
+        <w:t>Value of bigger input will be the smaller input</w:t>
+      </w:r>
+    </w:p>
+    <w:p>
+      <w:pPr>
+        <w:ind w:firstLine="720"/>
+        <w:rPr>
+          <w:lang w:val="en-US"/>
+        </w:rPr>
+      </w:pPr>
+      <w:r>
+        <w:rPr>
+          <w:lang w:val="en-US"/>
+        </w:rPr>
+        <w:t>Value of smaller input will be the remainder</w:t>
+      </w:r>
+    </w:p>
+    <w:p>
+      <w:pPr>
+        <w:rPr>
+          <w:lang w:val="en-US"/>
+        </w:rPr>
+      </w:pPr>
+    </w:p>
+    <w:p>
+      <w:pPr>
+        <w:rPr>
+          <w:lang w:val="en-US"/>
+        </w:rPr>
+      </w:pPr>
     </w:p>
     <w:sectPr>
       <w:pgSz w:w="11906" w:h="16838"/>

</xml_diff>